<commit_message>
Save work before switching to main
</commit_message>
<xml_diff>
--- a/DBModeling_homework2/DB_report.docx
+++ b/DBModeling_homework2/DB_report.docx
@@ -555,6 +555,86 @@
         <w:pStyle w:val="a7"/>
         <w:numPr>
           <w:ilvl w:val="0"/>
+          <w:numId w:val="1"/>
+        </w:numPr>
+        <w:spacing w:after="0"/>
+        <w:jc w:val="both"/>
+        <w:rPr>
+          <w:rFonts w:asciiTheme="majorHAnsi" w:hAnsiTheme="majorHAnsi"/>
+          <w:lang w:val="en-US"/>
+        </w:rPr>
+      </w:pPr>
+      <w:r>
+        <w:rPr>
+          <w:rFonts w:asciiTheme="majorHAnsi" w:hAnsiTheme="majorHAnsi"/>
+          <w:lang w:val="en-US"/>
+        </w:rPr>
+        <w:t>Address: VARCHAR (</w:t>
+      </w:r>
+      <w:r>
+        <w:rPr>
+          <w:rFonts w:asciiTheme="majorHAnsi" w:hAnsiTheme="majorHAnsi"/>
+          <w:lang w:val="en-US"/>
+        </w:rPr>
+        <w:t>2</w:t>
+      </w:r>
+      <w:r>
+        <w:rPr>
+          <w:rFonts w:asciiTheme="majorHAnsi" w:hAnsiTheme="majorHAnsi"/>
+          <w:lang w:val="en-US"/>
+        </w:rPr>
+        <w:t>00), NOT NULL</w:t>
+      </w:r>
+    </w:p>
+    <w:p>
+      <w:pPr>
+        <w:pStyle w:val="a7"/>
+        <w:numPr>
+          <w:ilvl w:val="0"/>
+          <w:numId w:val="1"/>
+        </w:numPr>
+        <w:spacing w:after="0"/>
+        <w:jc w:val="both"/>
+        <w:rPr>
+          <w:rFonts w:asciiTheme="majorHAnsi" w:hAnsiTheme="majorHAnsi"/>
+          <w:lang w:val="en-US"/>
+        </w:rPr>
+      </w:pPr>
+      <w:r>
+        <w:rPr>
+          <w:rFonts w:asciiTheme="majorHAnsi" w:hAnsiTheme="majorHAnsi"/>
+          <w:lang w:val="en-US"/>
+        </w:rPr>
+        <w:t>Phone: INTEGER, NOT NULL</w:t>
+      </w:r>
+    </w:p>
+    <w:p>
+      <w:pPr>
+        <w:pStyle w:val="a7"/>
+        <w:numPr>
+          <w:ilvl w:val="0"/>
+          <w:numId w:val="1"/>
+        </w:numPr>
+        <w:spacing w:after="0"/>
+        <w:jc w:val="both"/>
+        <w:rPr>
+          <w:rFonts w:asciiTheme="majorHAnsi" w:hAnsiTheme="majorHAnsi"/>
+          <w:lang w:val="en-US"/>
+        </w:rPr>
+      </w:pPr>
+      <w:r>
+        <w:rPr>
+          <w:rFonts w:asciiTheme="majorHAnsi" w:hAnsiTheme="majorHAnsi"/>
+          <w:lang w:val="en-US"/>
+        </w:rPr>
+        <w:t>Email: VARCHAR (100)</w:t>
+      </w:r>
+    </w:p>
+    <w:p>
+      <w:pPr>
+        <w:pStyle w:val="a7"/>
+        <w:numPr>
+          <w:ilvl w:val="0"/>
           <w:numId w:val="11"/>
         </w:numPr>
         <w:spacing w:after="0"/>
@@ -648,7 +728,14 @@
           <w:rFonts w:asciiTheme="majorHAnsi" w:hAnsiTheme="majorHAnsi"/>
           <w:lang w:val="en-US"/>
         </w:rPr>
-        <w:t>UQ_OwnerFullName</w:t>
+        <w:t>UQ_Owner</w:t>
+      </w:r>
+      <w:r>
+        <w:rPr>
+          <w:rFonts w:asciiTheme="majorHAnsi" w:hAnsiTheme="majorHAnsi"/>
+          <w:lang w:val="en-US"/>
+        </w:rPr>
+        <w:t>Info</w:t>
       </w:r>
       <w:proofErr w:type="spellEnd"/>
       <w:r>
@@ -656,12 +743,28 @@
           <w:rFonts w:asciiTheme="majorHAnsi" w:hAnsiTheme="majorHAnsi"/>
           <w:lang w:val="en-US"/>
         </w:rPr>
-        <w:t>: UNIQUE (FirstName, LastName)</w:t>
-      </w:r>
-    </w:p>
-    <w:p>
-      <w:pPr>
-        <w:spacing w:after="0"/>
+        <w:t>: UNIQUE (FirstName, LastName</w:t>
+      </w:r>
+      <w:r>
+        <w:rPr>
+          <w:rFonts w:asciiTheme="majorHAnsi" w:hAnsiTheme="majorHAnsi"/>
+          <w:lang w:val="en-US"/>
+        </w:rPr>
+        <w:t>, Phone, Address</w:t>
+      </w:r>
+      <w:r>
+        <w:rPr>
+          <w:rFonts w:asciiTheme="majorHAnsi" w:hAnsiTheme="majorHAnsi"/>
+          <w:lang w:val="en-US"/>
+        </w:rPr>
+        <w:t>)</w:t>
+      </w:r>
+    </w:p>
+    <w:p>
+      <w:pPr>
+        <w:pStyle w:val="a7"/>
+        <w:spacing w:after="0"/>
+        <w:ind w:left="2148"/>
         <w:jc w:val="both"/>
         <w:rPr>
           <w:rFonts w:asciiTheme="majorHAnsi" w:hAnsiTheme="majorHAnsi"/>
@@ -697,8 +800,17 @@
           <w:rFonts w:asciiTheme="majorHAnsi" w:hAnsiTheme="majorHAnsi"/>
           <w:lang w:val="en-US"/>
         </w:rPr>
-        <w:t>: Pets</w:t>
-      </w:r>
+        <w:t xml:space="preserve">: </w:t>
+      </w:r>
+      <w:proofErr w:type="spellStart"/>
+      <w:r>
+        <w:rPr>
+          <w:rFonts w:asciiTheme="majorHAnsi" w:hAnsiTheme="majorHAnsi"/>
+          <w:lang w:val="en-US"/>
+        </w:rPr>
+        <w:t>Species_served</w:t>
+      </w:r>
+      <w:proofErr w:type="spellEnd"/>
     </w:p>
     <w:p>
       <w:pPr>
@@ -823,7 +935,7 @@
           <w:rFonts w:asciiTheme="majorHAnsi" w:hAnsiTheme="majorHAnsi"/>
           <w:lang w:val="en-US"/>
         </w:rPr>
-        <w:t>PetID</w:t>
+        <w:t>SpeciesID</w:t>
       </w:r>
       <w:proofErr w:type="spellEnd"/>
       <w:r>
@@ -870,115 +982,6 @@
           <w:lang w:val="en-US"/>
         </w:rPr>
         <w:t>100), NOT NULL</w:t>
-      </w:r>
-    </w:p>
-    <w:p>
-      <w:pPr>
-        <w:pStyle w:val="a7"/>
-        <w:numPr>
-          <w:ilvl w:val="0"/>
-          <w:numId w:val="1"/>
-        </w:numPr>
-        <w:spacing w:after="0"/>
-        <w:jc w:val="both"/>
-        <w:rPr>
-          <w:rFonts w:asciiTheme="majorHAnsi" w:hAnsiTheme="majorHAnsi"/>
-          <w:lang w:val="en-US"/>
-        </w:rPr>
-      </w:pPr>
-      <w:proofErr w:type="spellStart"/>
-      <w:r>
-        <w:rPr>
-          <w:rFonts w:asciiTheme="majorHAnsi" w:hAnsiTheme="majorHAnsi"/>
-          <w:lang w:val="en-US"/>
-        </w:rPr>
-        <w:t>PetName</w:t>
-      </w:r>
-      <w:proofErr w:type="spellEnd"/>
-      <w:r>
-        <w:rPr>
-          <w:rFonts w:asciiTheme="majorHAnsi" w:hAnsiTheme="majorHAnsi"/>
-          <w:lang w:val="en-US"/>
-        </w:rPr>
-        <w:t xml:space="preserve">: </w:t>
-      </w:r>
-      <w:proofErr w:type="gramStart"/>
-      <w:r>
-        <w:rPr>
-          <w:rFonts w:asciiTheme="majorHAnsi" w:hAnsiTheme="majorHAnsi"/>
-          <w:lang w:val="en-US"/>
-        </w:rPr>
-        <w:t>VARCHAR(</w:t>
-      </w:r>
-      <w:proofErr w:type="gramEnd"/>
-      <w:r>
-        <w:rPr>
-          <w:rFonts w:asciiTheme="majorHAnsi" w:hAnsiTheme="majorHAnsi"/>
-          <w:lang w:val="en-US"/>
-        </w:rPr>
-        <w:t>100), NOT NULL</w:t>
-      </w:r>
-    </w:p>
-    <w:p>
-      <w:pPr>
-        <w:pStyle w:val="a7"/>
-        <w:numPr>
-          <w:ilvl w:val="0"/>
-          <w:numId w:val="1"/>
-        </w:numPr>
-        <w:spacing w:after="0"/>
-        <w:jc w:val="both"/>
-        <w:rPr>
-          <w:rFonts w:asciiTheme="majorHAnsi" w:hAnsiTheme="majorHAnsi"/>
-          <w:lang w:val="en-US"/>
-        </w:rPr>
-      </w:pPr>
-      <w:proofErr w:type="spellStart"/>
-      <w:r>
-        <w:rPr>
-          <w:rFonts w:asciiTheme="majorHAnsi" w:hAnsiTheme="majorHAnsi"/>
-          <w:lang w:val="en-US"/>
-        </w:rPr>
-        <w:t>PetAge</w:t>
-      </w:r>
-      <w:proofErr w:type="spellEnd"/>
-      <w:r>
-        <w:rPr>
-          <w:rFonts w:asciiTheme="majorHAnsi" w:hAnsiTheme="majorHAnsi"/>
-          <w:lang w:val="en-US"/>
-        </w:rPr>
-        <w:t>: INTEGER, NOT NULL</w:t>
-      </w:r>
-    </w:p>
-    <w:p>
-      <w:pPr>
-        <w:pStyle w:val="a7"/>
-        <w:numPr>
-          <w:ilvl w:val="0"/>
-          <w:numId w:val="1"/>
-        </w:numPr>
-        <w:spacing w:after="0"/>
-        <w:jc w:val="both"/>
-        <w:rPr>
-          <w:rFonts w:asciiTheme="majorHAnsi" w:hAnsiTheme="majorHAnsi"/>
-          <w:lang w:val="en-US"/>
-        </w:rPr>
-      </w:pPr>
-      <w:proofErr w:type="spellStart"/>
-      <w:r>
-        <w:rPr>
-          <w:rFonts w:asciiTheme="majorHAnsi" w:hAnsiTheme="majorHAnsi"/>
-          <w:lang w:val="en-US"/>
-        </w:rPr>
-        <w:t>OwnerID</w:t>
-      </w:r>
-      <w:proofErr w:type="spellEnd"/>
-      <w:r>
-        <w:rPr>
-          <w:rFonts w:asciiTheme="majorHAnsi" w:hAnsiTheme="majorHAnsi"/>
-          <w:lang w:val="en-US"/>
-        </w:rPr>
-        <w:t>: INTEGER, FK (REFERENCES Owners), NOT NULL</w:t>
       </w:r>
     </w:p>
     <w:p>
@@ -1036,7 +1039,14 @@
           <w:rFonts w:asciiTheme="majorHAnsi" w:hAnsiTheme="majorHAnsi"/>
           <w:lang w:val="en-US"/>
         </w:rPr>
-        <w:t>PK_Pets</w:t>
+        <w:t>PK_</w:t>
+      </w:r>
+      <w:r>
+        <w:rPr>
+          <w:rFonts w:asciiTheme="majorHAnsi" w:hAnsiTheme="majorHAnsi"/>
+          <w:lang w:val="en-US"/>
+        </w:rPr>
+        <w:t>Species</w:t>
       </w:r>
       <w:proofErr w:type="spellEnd"/>
       <w:r>
@@ -1052,6 +1062,191 @@
           <w:rFonts w:asciiTheme="majorHAnsi" w:hAnsiTheme="majorHAnsi"/>
           <w:lang w:val="en-US"/>
         </w:rPr>
+        <w:t>SpeciesI</w:t>
+      </w:r>
+      <w:r>
+        <w:rPr>
+          <w:rFonts w:asciiTheme="majorHAnsi" w:hAnsiTheme="majorHAnsi"/>
+          <w:lang w:val="en-US"/>
+        </w:rPr>
+        <w:t>D</w:t>
+      </w:r>
+      <w:proofErr w:type="spellEnd"/>
+      <w:r>
+        <w:rPr>
+          <w:rFonts w:asciiTheme="majorHAnsi" w:hAnsiTheme="majorHAnsi"/>
+          <w:lang w:val="en-US"/>
+        </w:rPr>
+        <w:t>)</w:t>
+      </w:r>
+    </w:p>
+    <w:p>
+      <w:pPr>
+        <w:pStyle w:val="a7"/>
+        <w:spacing w:after="0"/>
+        <w:ind w:left="2138"/>
+        <w:jc w:val="both"/>
+        <w:rPr>
+          <w:rFonts w:asciiTheme="majorHAnsi" w:hAnsiTheme="majorHAnsi"/>
+          <w:lang w:val="en-US"/>
+        </w:rPr>
+      </w:pPr>
+    </w:p>
+    <w:p>
+      <w:pPr>
+        <w:pStyle w:val="a7"/>
+        <w:numPr>
+          <w:ilvl w:val="0"/>
+          <w:numId w:val="9"/>
+        </w:numPr>
+        <w:spacing w:after="0"/>
+        <w:jc w:val="both"/>
+        <w:rPr>
+          <w:rFonts w:asciiTheme="majorHAnsi" w:hAnsiTheme="majorHAnsi"/>
+          <w:lang w:val="en-US"/>
+        </w:rPr>
+      </w:pPr>
+      <w:r>
+        <w:rPr>
+          <w:rFonts w:asciiTheme="majorHAnsi" w:hAnsiTheme="majorHAnsi"/>
+          <w:b/>
+          <w:bCs/>
+          <w:lang w:val="en-US"/>
+        </w:rPr>
+        <w:t>Table Name</w:t>
+      </w:r>
+      <w:r>
+        <w:rPr>
+          <w:rFonts w:asciiTheme="majorHAnsi" w:hAnsiTheme="majorHAnsi"/>
+          <w:lang w:val="en-US"/>
+        </w:rPr>
+        <w:t>: Pets</w:t>
+      </w:r>
+    </w:p>
+    <w:p>
+      <w:pPr>
+        <w:pStyle w:val="a7"/>
+        <w:numPr>
+          <w:ilvl w:val="0"/>
+          <w:numId w:val="11"/>
+        </w:numPr>
+        <w:spacing w:after="0"/>
+        <w:ind w:hanging="435"/>
+        <w:jc w:val="both"/>
+        <w:rPr>
+          <w:rFonts w:asciiTheme="majorHAnsi" w:hAnsiTheme="majorHAnsi"/>
+          <w:lang w:val="en-US"/>
+        </w:rPr>
+      </w:pPr>
+      <w:r>
+        <w:rPr>
+          <w:rFonts w:asciiTheme="majorHAnsi" w:hAnsiTheme="majorHAnsi"/>
+          <w:b/>
+          <w:bCs/>
+          <w:lang w:val="en-US"/>
+        </w:rPr>
+        <w:lastRenderedPageBreak/>
+        <w:t>Description</w:t>
+      </w:r>
+      <w:r>
+        <w:rPr>
+          <w:rFonts w:asciiTheme="majorHAnsi" w:hAnsiTheme="majorHAnsi"/>
+          <w:lang w:val="en-US"/>
+        </w:rPr>
+        <w:t xml:space="preserve">: </w:t>
+      </w:r>
+      <w:r>
+        <w:rPr>
+          <w:rFonts w:asciiTheme="majorHAnsi" w:hAnsiTheme="majorHAnsi"/>
+        </w:rPr>
+        <w:t>Хранит</w:t>
+      </w:r>
+      <w:r>
+        <w:rPr>
+          <w:rFonts w:asciiTheme="majorHAnsi" w:hAnsiTheme="majorHAnsi"/>
+          <w:lang w:val="en-US"/>
+        </w:rPr>
+        <w:t xml:space="preserve"> </w:t>
+      </w:r>
+      <w:r>
+        <w:rPr>
+          <w:rFonts w:asciiTheme="majorHAnsi" w:hAnsiTheme="majorHAnsi"/>
+        </w:rPr>
+        <w:t>информацию</w:t>
+      </w:r>
+      <w:r>
+        <w:rPr>
+          <w:rFonts w:asciiTheme="majorHAnsi" w:hAnsiTheme="majorHAnsi"/>
+          <w:lang w:val="en-US"/>
+        </w:rPr>
+        <w:t xml:space="preserve"> </w:t>
+      </w:r>
+      <w:r>
+        <w:rPr>
+          <w:rFonts w:asciiTheme="majorHAnsi" w:hAnsiTheme="majorHAnsi"/>
+        </w:rPr>
+        <w:t>питомцах</w:t>
+      </w:r>
+      <w:r>
+        <w:rPr>
+          <w:rFonts w:asciiTheme="majorHAnsi" w:hAnsiTheme="majorHAnsi"/>
+          <w:lang w:val="en-US"/>
+        </w:rPr>
+        <w:t>.</w:t>
+      </w:r>
+    </w:p>
+    <w:p>
+      <w:pPr>
+        <w:pStyle w:val="a7"/>
+        <w:numPr>
+          <w:ilvl w:val="0"/>
+          <w:numId w:val="11"/>
+        </w:numPr>
+        <w:spacing w:after="0"/>
+        <w:ind w:hanging="435"/>
+        <w:jc w:val="both"/>
+        <w:rPr>
+          <w:rFonts w:asciiTheme="majorHAnsi" w:hAnsiTheme="majorHAnsi"/>
+          <w:lang w:val="en-US"/>
+        </w:rPr>
+      </w:pPr>
+      <w:r>
+        <w:rPr>
+          <w:rFonts w:asciiTheme="majorHAnsi" w:hAnsiTheme="majorHAnsi"/>
+          <w:b/>
+          <w:bCs/>
+          <w:lang w:val="en-US"/>
+        </w:rPr>
+        <w:t>Attributes</w:t>
+      </w:r>
+      <w:r>
+        <w:rPr>
+          <w:rFonts w:asciiTheme="majorHAnsi" w:hAnsiTheme="majorHAnsi"/>
+          <w:lang w:val="en-US"/>
+        </w:rPr>
+        <w:t>:</w:t>
+      </w:r>
+    </w:p>
+    <w:p>
+      <w:pPr>
+        <w:pStyle w:val="a7"/>
+        <w:numPr>
+          <w:ilvl w:val="0"/>
+          <w:numId w:val="1"/>
+        </w:numPr>
+        <w:spacing w:after="0"/>
+        <w:jc w:val="both"/>
+        <w:rPr>
+          <w:rFonts w:asciiTheme="majorHAnsi" w:hAnsiTheme="majorHAnsi"/>
+          <w:lang w:val="en-US"/>
+        </w:rPr>
+      </w:pPr>
+      <w:proofErr w:type="spellStart"/>
+      <w:r>
+        <w:rPr>
+          <w:rFonts w:asciiTheme="majorHAnsi" w:hAnsiTheme="majorHAnsi"/>
+          <w:lang w:val="en-US"/>
+        </w:rPr>
         <w:t>PetID</w:t>
       </w:r>
       <w:proofErr w:type="spellEnd"/>
@@ -1060,7 +1255,220 @@
           <w:rFonts w:asciiTheme="majorHAnsi" w:hAnsiTheme="majorHAnsi"/>
           <w:lang w:val="en-US"/>
         </w:rPr>
-        <w:t>)</w:t>
+        <w:t>: INTEGER, PK</w:t>
+      </w:r>
+    </w:p>
+    <w:p>
+      <w:pPr>
+        <w:pStyle w:val="a7"/>
+        <w:numPr>
+          <w:ilvl w:val="0"/>
+          <w:numId w:val="1"/>
+        </w:numPr>
+        <w:spacing w:after="0"/>
+        <w:jc w:val="both"/>
+        <w:rPr>
+          <w:rFonts w:asciiTheme="majorHAnsi" w:hAnsiTheme="majorHAnsi"/>
+          <w:lang w:val="en-US"/>
+        </w:rPr>
+      </w:pPr>
+      <w:r>
+        <w:rPr>
+          <w:rFonts w:asciiTheme="majorHAnsi" w:hAnsiTheme="majorHAnsi"/>
+          <w:lang w:val="en-US"/>
+        </w:rPr>
+        <w:t xml:space="preserve">Species: </w:t>
+      </w:r>
+      <w:proofErr w:type="gramStart"/>
+      <w:r>
+        <w:rPr>
+          <w:rFonts w:asciiTheme="majorHAnsi" w:hAnsiTheme="majorHAnsi"/>
+          <w:lang w:val="en-US"/>
+        </w:rPr>
+        <w:t>VARCHAR(</w:t>
+      </w:r>
+      <w:proofErr w:type="gramEnd"/>
+      <w:r>
+        <w:rPr>
+          <w:rFonts w:asciiTheme="majorHAnsi" w:hAnsiTheme="majorHAnsi"/>
+          <w:lang w:val="en-US"/>
+        </w:rPr>
+        <w:t>100), NOT NULL</w:t>
+      </w:r>
+    </w:p>
+    <w:p>
+      <w:pPr>
+        <w:pStyle w:val="a7"/>
+        <w:numPr>
+          <w:ilvl w:val="0"/>
+          <w:numId w:val="1"/>
+        </w:numPr>
+        <w:spacing w:after="0"/>
+        <w:jc w:val="both"/>
+        <w:rPr>
+          <w:rFonts w:asciiTheme="majorHAnsi" w:hAnsiTheme="majorHAnsi"/>
+          <w:lang w:val="en-US"/>
+        </w:rPr>
+      </w:pPr>
+      <w:proofErr w:type="spellStart"/>
+      <w:r>
+        <w:rPr>
+          <w:rFonts w:asciiTheme="majorHAnsi" w:hAnsiTheme="majorHAnsi"/>
+          <w:lang w:val="en-US"/>
+        </w:rPr>
+        <w:t>PetName</w:t>
+      </w:r>
+      <w:proofErr w:type="spellEnd"/>
+      <w:r>
+        <w:rPr>
+          <w:rFonts w:asciiTheme="majorHAnsi" w:hAnsiTheme="majorHAnsi"/>
+          <w:lang w:val="en-US"/>
+        </w:rPr>
+        <w:t xml:space="preserve">: </w:t>
+      </w:r>
+      <w:proofErr w:type="gramStart"/>
+      <w:r>
+        <w:rPr>
+          <w:rFonts w:asciiTheme="majorHAnsi" w:hAnsiTheme="majorHAnsi"/>
+          <w:lang w:val="en-US"/>
+        </w:rPr>
+        <w:t>VARCHAR(</w:t>
+      </w:r>
+      <w:proofErr w:type="gramEnd"/>
+      <w:r>
+        <w:rPr>
+          <w:rFonts w:asciiTheme="majorHAnsi" w:hAnsiTheme="majorHAnsi"/>
+          <w:lang w:val="en-US"/>
+        </w:rPr>
+        <w:t>100), NOT NULL</w:t>
+      </w:r>
+    </w:p>
+    <w:p>
+      <w:pPr>
+        <w:pStyle w:val="a7"/>
+        <w:numPr>
+          <w:ilvl w:val="0"/>
+          <w:numId w:val="1"/>
+        </w:numPr>
+        <w:spacing w:after="0"/>
+        <w:jc w:val="both"/>
+        <w:rPr>
+          <w:rFonts w:asciiTheme="majorHAnsi" w:hAnsiTheme="majorHAnsi"/>
+          <w:lang w:val="en-US"/>
+        </w:rPr>
+      </w:pPr>
+      <w:proofErr w:type="spellStart"/>
+      <w:r>
+        <w:rPr>
+          <w:rFonts w:asciiTheme="majorHAnsi" w:hAnsiTheme="majorHAnsi"/>
+          <w:lang w:val="en-US"/>
+        </w:rPr>
+        <w:t>PetAge</w:t>
+      </w:r>
+      <w:proofErr w:type="spellEnd"/>
+      <w:r>
+        <w:rPr>
+          <w:rFonts w:asciiTheme="majorHAnsi" w:hAnsiTheme="majorHAnsi"/>
+          <w:lang w:val="en-US"/>
+        </w:rPr>
+        <w:t>: INTEGER, NOT NULL</w:t>
+      </w:r>
+    </w:p>
+    <w:p>
+      <w:pPr>
+        <w:pStyle w:val="a7"/>
+        <w:numPr>
+          <w:ilvl w:val="0"/>
+          <w:numId w:val="1"/>
+        </w:numPr>
+        <w:spacing w:after="0"/>
+        <w:jc w:val="both"/>
+        <w:rPr>
+          <w:rFonts w:asciiTheme="majorHAnsi" w:hAnsiTheme="majorHAnsi"/>
+          <w:lang w:val="en-US"/>
+        </w:rPr>
+      </w:pPr>
+      <w:proofErr w:type="spellStart"/>
+      <w:r>
+        <w:rPr>
+          <w:rFonts w:asciiTheme="majorHAnsi" w:hAnsiTheme="majorHAnsi"/>
+          <w:lang w:val="en-US"/>
+        </w:rPr>
+        <w:t>OwnerID</w:t>
+      </w:r>
+      <w:proofErr w:type="spellEnd"/>
+      <w:r>
+        <w:rPr>
+          <w:rFonts w:asciiTheme="majorHAnsi" w:hAnsiTheme="majorHAnsi"/>
+          <w:lang w:val="en-US"/>
+        </w:rPr>
+        <w:t>: INTEGER, FK (REFERENCES Owners), NOT NULL</w:t>
+      </w:r>
+    </w:p>
+    <w:p>
+      <w:pPr>
+        <w:pStyle w:val="a7"/>
+        <w:numPr>
+          <w:ilvl w:val="0"/>
+          <w:numId w:val="1"/>
+        </w:numPr>
+        <w:spacing w:after="0"/>
+        <w:jc w:val="both"/>
+        <w:rPr>
+          <w:rFonts w:asciiTheme="majorHAnsi" w:hAnsiTheme="majorHAnsi"/>
+          <w:lang w:val="en-US"/>
+        </w:rPr>
+      </w:pPr>
+      <w:proofErr w:type="spellStart"/>
+      <w:r>
+        <w:rPr>
+          <w:rFonts w:asciiTheme="majorHAnsi" w:hAnsiTheme="majorHAnsi"/>
+          <w:lang w:val="en-US"/>
+        </w:rPr>
+        <w:t>SpeciesID</w:t>
+      </w:r>
+      <w:proofErr w:type="spellEnd"/>
+      <w:r>
+        <w:rPr>
+          <w:rFonts w:asciiTheme="majorHAnsi" w:hAnsiTheme="majorHAnsi"/>
+          <w:lang w:val="en-US"/>
+        </w:rPr>
+        <w:t>: INTEGER, FK (REFERENCES Species), NOT NULL</w:t>
+      </w:r>
+    </w:p>
+    <w:p>
+      <w:pPr>
+        <w:pStyle w:val="a7"/>
+        <w:numPr>
+          <w:ilvl w:val="0"/>
+          <w:numId w:val="12"/>
+        </w:numPr>
+        <w:tabs>
+          <w:tab w:val="left" w:pos="1418"/>
+        </w:tabs>
+        <w:spacing w:after="0"/>
+        <w:ind w:left="1418" w:hanging="425"/>
+        <w:jc w:val="both"/>
+        <w:rPr>
+          <w:rFonts w:asciiTheme="majorHAnsi" w:hAnsiTheme="majorHAnsi"/>
+          <w:lang w:val="en-US"/>
+        </w:rPr>
+      </w:pPr>
+      <w:r>
+        <w:rPr>
+          <w:rFonts w:asciiTheme="majorHAnsi" w:hAnsiTheme="majorHAnsi"/>
+          <w:b/>
+          <w:bCs/>
+          <w:lang w:val="en-US"/>
+        </w:rPr>
+        <w:t>Constraints</w:t>
+      </w:r>
+      <w:r>
+        <w:rPr>
+          <w:rFonts w:asciiTheme="majorHAnsi" w:hAnsiTheme="majorHAnsi"/>
+          <w:lang w:val="en-US"/>
+        </w:rPr>
+        <w:t>:</w:t>
       </w:r>
     </w:p>
     <w:p>
@@ -1083,7 +1491,7 @@
           <w:rFonts w:asciiTheme="majorHAnsi" w:hAnsiTheme="majorHAnsi"/>
           <w:lang w:val="en-US"/>
         </w:rPr>
-        <w:t>FK_PetsOwner</w:t>
+        <w:t>PK_Pets</w:t>
       </w:r>
       <w:proofErr w:type="spellEnd"/>
       <w:r>
@@ -1091,7 +1499,7 @@
           <w:rFonts w:asciiTheme="majorHAnsi" w:hAnsiTheme="majorHAnsi"/>
           <w:lang w:val="en-US"/>
         </w:rPr>
-        <w:t>: FOREIGN KEY (</w:t>
+        <w:t>: PRIMARY KEY (</w:t>
       </w:r>
       <w:proofErr w:type="spellStart"/>
       <w:r>
@@ -1099,32 +1507,7 @@
           <w:rFonts w:asciiTheme="majorHAnsi" w:hAnsiTheme="majorHAnsi"/>
           <w:lang w:val="en-US"/>
         </w:rPr>
-        <w:t>OwnerID</w:t>
-      </w:r>
-      <w:proofErr w:type="spellEnd"/>
-      <w:r>
-        <w:rPr>
-          <w:rFonts w:asciiTheme="majorHAnsi" w:hAnsiTheme="majorHAnsi"/>
-          <w:lang w:val="en-US"/>
-        </w:rPr>
-        <w:t xml:space="preserve">) REFERENCES </w:t>
-      </w:r>
-      <w:proofErr w:type="gramStart"/>
-      <w:r>
-        <w:rPr>
-          <w:rFonts w:asciiTheme="majorHAnsi" w:hAnsiTheme="majorHAnsi"/>
-          <w:lang w:val="en-US"/>
-        </w:rPr>
-        <w:t>Owners(</w:t>
-      </w:r>
-      <w:proofErr w:type="spellStart"/>
-      <w:proofErr w:type="gramEnd"/>
-      <w:r>
-        <w:rPr>
-          <w:rFonts w:asciiTheme="majorHAnsi" w:hAnsiTheme="majorHAnsi"/>
-          <w:lang w:val="en-US"/>
-        </w:rPr>
-        <w:t>OwnerID</w:t>
+        <w:t>PetID</w:t>
       </w:r>
       <w:proofErr w:type="spellEnd"/>
       <w:r>
@@ -1155,6 +1538,173 @@
           <w:rFonts w:asciiTheme="majorHAnsi" w:hAnsiTheme="majorHAnsi"/>
           <w:lang w:val="en-US"/>
         </w:rPr>
+        <w:t>FK_PetsOwner</w:t>
+      </w:r>
+      <w:proofErr w:type="spellEnd"/>
+      <w:r>
+        <w:rPr>
+          <w:rFonts w:asciiTheme="majorHAnsi" w:hAnsiTheme="majorHAnsi"/>
+          <w:lang w:val="en-US"/>
+        </w:rPr>
+        <w:t>: FOREIGN KEY (</w:t>
+      </w:r>
+      <w:proofErr w:type="spellStart"/>
+      <w:r>
+        <w:rPr>
+          <w:rFonts w:asciiTheme="majorHAnsi" w:hAnsiTheme="majorHAnsi"/>
+          <w:lang w:val="en-US"/>
+        </w:rPr>
+        <w:t>OwnerID</w:t>
+      </w:r>
+      <w:proofErr w:type="spellEnd"/>
+      <w:r>
+        <w:rPr>
+          <w:rFonts w:asciiTheme="majorHAnsi" w:hAnsiTheme="majorHAnsi"/>
+          <w:lang w:val="en-US"/>
+        </w:rPr>
+        <w:t xml:space="preserve">) REFERENCES </w:t>
+      </w:r>
+      <w:proofErr w:type="gramStart"/>
+      <w:r>
+        <w:rPr>
+          <w:rFonts w:asciiTheme="majorHAnsi" w:hAnsiTheme="majorHAnsi"/>
+          <w:lang w:val="en-US"/>
+        </w:rPr>
+        <w:t>Owners(</w:t>
+      </w:r>
+      <w:proofErr w:type="spellStart"/>
+      <w:proofErr w:type="gramEnd"/>
+      <w:r>
+        <w:rPr>
+          <w:rFonts w:asciiTheme="majorHAnsi" w:hAnsiTheme="majorHAnsi"/>
+          <w:lang w:val="en-US"/>
+        </w:rPr>
+        <w:t>OwnerID</w:t>
+      </w:r>
+      <w:proofErr w:type="spellEnd"/>
+      <w:r>
+        <w:rPr>
+          <w:rFonts w:asciiTheme="majorHAnsi" w:hAnsiTheme="majorHAnsi"/>
+          <w:lang w:val="en-US"/>
+        </w:rPr>
+        <w:t>)</w:t>
+      </w:r>
+    </w:p>
+    <w:p>
+      <w:pPr>
+        <w:pStyle w:val="a7"/>
+        <w:numPr>
+          <w:ilvl w:val="0"/>
+          <w:numId w:val="3"/>
+        </w:numPr>
+        <w:spacing w:after="0"/>
+        <w:jc w:val="both"/>
+        <w:rPr>
+          <w:rFonts w:asciiTheme="majorHAnsi" w:hAnsiTheme="majorHAnsi"/>
+          <w:lang w:val="en-US"/>
+        </w:rPr>
+      </w:pPr>
+      <w:proofErr w:type="spellStart"/>
+      <w:r>
+        <w:rPr>
+          <w:rFonts w:asciiTheme="majorHAnsi" w:hAnsiTheme="majorHAnsi"/>
+          <w:lang w:val="en-US"/>
+        </w:rPr>
+        <w:t>FK_Pets</w:t>
+      </w:r>
+      <w:r>
+        <w:rPr>
+          <w:rFonts w:asciiTheme="majorHAnsi" w:hAnsiTheme="majorHAnsi"/>
+          <w:lang w:val="en-US"/>
+        </w:rPr>
+        <w:t>Species</w:t>
+      </w:r>
+      <w:proofErr w:type="spellEnd"/>
+      <w:r>
+        <w:rPr>
+          <w:rFonts w:asciiTheme="majorHAnsi" w:hAnsiTheme="majorHAnsi"/>
+          <w:lang w:val="en-US"/>
+        </w:rPr>
+        <w:t>: FOREIGN KEY (</w:t>
+      </w:r>
+      <w:proofErr w:type="spellStart"/>
+      <w:r>
+        <w:rPr>
+          <w:rFonts w:asciiTheme="majorHAnsi" w:hAnsiTheme="majorHAnsi"/>
+          <w:lang w:val="en-US"/>
+        </w:rPr>
+        <w:t>SpeciesID</w:t>
+      </w:r>
+      <w:proofErr w:type="spellEnd"/>
+      <w:r>
+        <w:rPr>
+          <w:rFonts w:asciiTheme="majorHAnsi" w:hAnsiTheme="majorHAnsi"/>
+          <w:lang w:val="en-US"/>
+        </w:rPr>
+        <w:t xml:space="preserve">) REFERENCES </w:t>
+      </w:r>
+      <w:proofErr w:type="spellStart"/>
+      <w:r>
+        <w:rPr>
+          <w:rFonts w:asciiTheme="majorHAnsi" w:hAnsiTheme="majorHAnsi"/>
+          <w:lang w:val="en-US"/>
+        </w:rPr>
+        <w:t>Species_</w:t>
+      </w:r>
+      <w:proofErr w:type="gramStart"/>
+      <w:r>
+        <w:rPr>
+          <w:rFonts w:asciiTheme="majorHAnsi" w:hAnsiTheme="majorHAnsi"/>
+          <w:lang w:val="en-US"/>
+        </w:rPr>
+        <w:t>served</w:t>
+      </w:r>
+      <w:proofErr w:type="spellEnd"/>
+      <w:r>
+        <w:rPr>
+          <w:rFonts w:asciiTheme="majorHAnsi" w:hAnsiTheme="majorHAnsi"/>
+          <w:lang w:val="en-US"/>
+        </w:rPr>
+        <w:t>(</w:t>
+      </w:r>
+      <w:proofErr w:type="spellStart"/>
+      <w:proofErr w:type="gramEnd"/>
+      <w:r>
+        <w:rPr>
+          <w:rFonts w:asciiTheme="majorHAnsi" w:hAnsiTheme="majorHAnsi"/>
+          <w:lang w:val="en-US"/>
+        </w:rPr>
+        <w:t>SpeciesID</w:t>
+      </w:r>
+      <w:proofErr w:type="spellEnd"/>
+      <w:r>
+        <w:rPr>
+          <w:rFonts w:asciiTheme="majorHAnsi" w:hAnsiTheme="majorHAnsi"/>
+          <w:lang w:val="en-US"/>
+        </w:rPr>
+        <w:t>)</w:t>
+      </w:r>
+    </w:p>
+    <w:p>
+      <w:pPr>
+        <w:pStyle w:val="a7"/>
+        <w:numPr>
+          <w:ilvl w:val="0"/>
+          <w:numId w:val="3"/>
+        </w:numPr>
+        <w:spacing w:after="0"/>
+        <w:jc w:val="both"/>
+        <w:rPr>
+          <w:rFonts w:asciiTheme="majorHAnsi" w:hAnsiTheme="majorHAnsi"/>
+          <w:lang w:val="en-US"/>
+        </w:rPr>
+      </w:pPr>
+      <w:proofErr w:type="spellStart"/>
+      <w:r>
+        <w:rPr>
+          <w:rFonts w:asciiTheme="majorHAnsi" w:hAnsiTheme="majorHAnsi"/>
+          <w:lang w:val="en-US"/>
+        </w:rPr>
         <w:t>CHK_PetAge</w:t>
       </w:r>
       <w:proofErr w:type="spellEnd"/>
@@ -1412,7 +1962,7 @@
           <w:rFonts w:asciiTheme="majorHAnsi" w:hAnsiTheme="majorHAnsi"/>
           <w:lang w:val="en-US"/>
         </w:rPr>
-        <w:t>VetAge</w:t>
+        <w:t>BirthDate</w:t>
       </w:r>
       <w:proofErr w:type="spellEnd"/>
       <w:r>
@@ -1420,7 +1970,87 @@
           <w:rFonts w:asciiTheme="majorHAnsi" w:hAnsiTheme="majorHAnsi"/>
           <w:lang w:val="en-US"/>
         </w:rPr>
-        <w:t>: INTEGER, NOT NULL</w:t>
+        <w:t>: DATE, NOT NULL</w:t>
+      </w:r>
+    </w:p>
+    <w:p>
+      <w:pPr>
+        <w:pStyle w:val="a7"/>
+        <w:numPr>
+          <w:ilvl w:val="0"/>
+          <w:numId w:val="4"/>
+        </w:numPr>
+        <w:spacing w:after="0"/>
+        <w:jc w:val="both"/>
+        <w:rPr>
+          <w:rFonts w:asciiTheme="majorHAnsi" w:hAnsiTheme="majorHAnsi"/>
+          <w:lang w:val="en-US"/>
+        </w:rPr>
+      </w:pPr>
+      <w:r>
+        <w:rPr>
+          <w:rFonts w:asciiTheme="majorHAnsi" w:hAnsiTheme="majorHAnsi"/>
+          <w:lang w:val="en-US"/>
+        </w:rPr>
+        <w:t>Address: VARCHAR (</w:t>
+      </w:r>
+      <w:r>
+        <w:rPr>
+          <w:rFonts w:asciiTheme="majorHAnsi" w:hAnsiTheme="majorHAnsi"/>
+          <w:lang w:val="en-US"/>
+        </w:rPr>
+        <w:t>2</w:t>
+      </w:r>
+      <w:r>
+        <w:rPr>
+          <w:rFonts w:asciiTheme="majorHAnsi" w:hAnsiTheme="majorHAnsi"/>
+          <w:lang w:val="en-US"/>
+        </w:rPr>
+        <w:t>00), NOT NULL</w:t>
+      </w:r>
+    </w:p>
+    <w:p>
+      <w:pPr>
+        <w:pStyle w:val="a7"/>
+        <w:numPr>
+          <w:ilvl w:val="0"/>
+          <w:numId w:val="4"/>
+        </w:numPr>
+        <w:spacing w:after="0"/>
+        <w:jc w:val="both"/>
+        <w:rPr>
+          <w:rFonts w:asciiTheme="majorHAnsi" w:hAnsiTheme="majorHAnsi"/>
+          <w:lang w:val="en-US"/>
+        </w:rPr>
+      </w:pPr>
+      <w:r>
+        <w:rPr>
+          <w:rFonts w:asciiTheme="majorHAnsi" w:hAnsiTheme="majorHAnsi"/>
+          <w:lang w:val="en-US"/>
+        </w:rPr>
+        <w:t>Phone: INTEGER, NOT NULL</w:t>
+      </w:r>
+    </w:p>
+    <w:p>
+      <w:pPr>
+        <w:pStyle w:val="a7"/>
+        <w:numPr>
+          <w:ilvl w:val="0"/>
+          <w:numId w:val="4"/>
+        </w:numPr>
+        <w:spacing w:after="0"/>
+        <w:jc w:val="both"/>
+        <w:rPr>
+          <w:rFonts w:asciiTheme="majorHAnsi" w:hAnsiTheme="majorHAnsi"/>
+          <w:lang w:val="en-US"/>
+        </w:rPr>
+      </w:pPr>
+      <w:r>
+        <w:rPr>
+          <w:rFonts w:asciiTheme="majorHAnsi" w:hAnsiTheme="majorHAnsi"/>
+          <w:lang w:val="en-US"/>
+        </w:rPr>
+        <w:t>Email: VARCHAR (100), NOT NULL</w:t>
       </w:r>
     </w:p>
     <w:p>
@@ -1522,7 +2152,14 @@
           <w:rFonts w:asciiTheme="majorHAnsi" w:hAnsiTheme="majorHAnsi"/>
           <w:lang w:val="en-US"/>
         </w:rPr>
-        <w:t>UQ_VetFullName</w:t>
+        <w:t>UQ_V</w:t>
+      </w:r>
+      <w:r>
+        <w:rPr>
+          <w:rFonts w:asciiTheme="majorHAnsi" w:hAnsiTheme="majorHAnsi"/>
+          <w:lang w:val="en-US"/>
+        </w:rPr>
+        <w:t>etInfo</w:t>
       </w:r>
       <w:proofErr w:type="spellEnd"/>
       <w:r>
@@ -1530,7 +2167,21 @@
           <w:rFonts w:asciiTheme="majorHAnsi" w:hAnsiTheme="majorHAnsi"/>
           <w:lang w:val="en-US"/>
         </w:rPr>
-        <w:t>: UNIQUE (FirstName, LastName)</w:t>
+        <w:t>: UNIQUE (FirstName, LastName</w:t>
+      </w:r>
+      <w:r>
+        <w:rPr>
+          <w:rFonts w:asciiTheme="majorHAnsi" w:hAnsiTheme="majorHAnsi"/>
+          <w:lang w:val="en-US"/>
+        </w:rPr>
+        <w:t>, Birthdate, Phone</w:t>
+      </w:r>
+      <w:r>
+        <w:rPr>
+          <w:rFonts w:asciiTheme="majorHAnsi" w:hAnsiTheme="majorHAnsi"/>
+          <w:lang w:val="en-US"/>
+        </w:rPr>
+        <w:t>)</w:t>
       </w:r>
     </w:p>
     <w:p>
@@ -1744,35 +2395,12 @@
           <w:lang w:val="en-US"/>
         </w:rPr>
       </w:pPr>
-      <w:proofErr w:type="spellStart"/>
-      <w:r>
-        <w:rPr>
-          <w:rFonts w:asciiTheme="majorHAnsi" w:hAnsiTheme="majorHAnsi"/>
-          <w:lang w:val="en-US"/>
-        </w:rPr>
-        <w:t>VetID</w:t>
-      </w:r>
-      <w:proofErr w:type="spellEnd"/>
-      <w:r>
-        <w:rPr>
-          <w:rFonts w:asciiTheme="majorHAnsi" w:hAnsiTheme="majorHAnsi"/>
-          <w:lang w:val="en-US"/>
-        </w:rPr>
-        <w:t>: INTEGER, FK (RE</w:t>
-      </w:r>
-      <w:r>
-        <w:rPr>
-          <w:rFonts w:asciiTheme="majorHAnsi" w:hAnsiTheme="majorHAnsi"/>
-          <w:lang w:val="en-US"/>
-        </w:rPr>
-        <w:t>F</w:t>
-      </w:r>
-      <w:r>
-        <w:rPr>
-          <w:rFonts w:asciiTheme="majorHAnsi" w:hAnsiTheme="majorHAnsi"/>
-          <w:lang w:val="en-US"/>
-        </w:rPr>
-        <w:t>ERENCES Vets), NOT NULL</w:t>
+      <w:r>
+        <w:rPr>
+          <w:rFonts w:asciiTheme="majorHAnsi" w:hAnsiTheme="majorHAnsi"/>
+          <w:lang w:val="en-US"/>
+        </w:rPr>
+        <w:t>Reason: VARCHAR (300), NOT NULL</w:t>
       </w:r>
     </w:p>
     <w:p>
@@ -1795,7 +2423,7 @@
           <w:rFonts w:asciiTheme="majorHAnsi" w:hAnsiTheme="majorHAnsi"/>
           <w:lang w:val="en-US"/>
         </w:rPr>
-        <w:t>PetID</w:t>
+        <w:t>VetID</w:t>
       </w:r>
       <w:proofErr w:type="spellEnd"/>
       <w:r>
@@ -1803,7 +2431,21 @@
           <w:rFonts w:asciiTheme="majorHAnsi" w:hAnsiTheme="majorHAnsi"/>
           <w:lang w:val="en-US"/>
         </w:rPr>
-        <w:t>: INTEGER, FK (REFERENCES Pets), NOT NULL</w:t>
+        <w:t>: INTEGER, FK (RE</w:t>
+      </w:r>
+      <w:r>
+        <w:rPr>
+          <w:rFonts w:asciiTheme="majorHAnsi" w:hAnsiTheme="majorHAnsi"/>
+          <w:lang w:val="en-US"/>
+        </w:rPr>
+        <w:t>F</w:t>
+      </w:r>
+      <w:r>
+        <w:rPr>
+          <w:rFonts w:asciiTheme="majorHAnsi" w:hAnsiTheme="majorHAnsi"/>
+          <w:lang w:val="en-US"/>
+        </w:rPr>
+        <w:t>ERENCES Vets), NOT NULL</w:t>
       </w:r>
     </w:p>
     <w:p>
@@ -1814,6 +2456,37 @@
           <w:numId w:val="6"/>
         </w:numPr>
         <w:spacing w:after="0"/>
+        <w:jc w:val="both"/>
+        <w:rPr>
+          <w:rFonts w:asciiTheme="majorHAnsi" w:hAnsiTheme="majorHAnsi"/>
+          <w:lang w:val="en-US"/>
+        </w:rPr>
+      </w:pPr>
+      <w:proofErr w:type="spellStart"/>
+      <w:r>
+        <w:rPr>
+          <w:rFonts w:asciiTheme="majorHAnsi" w:hAnsiTheme="majorHAnsi"/>
+          <w:lang w:val="en-US"/>
+        </w:rPr>
+        <w:t>PetID</w:t>
+      </w:r>
+      <w:proofErr w:type="spellEnd"/>
+      <w:r>
+        <w:rPr>
+          <w:rFonts w:asciiTheme="majorHAnsi" w:hAnsiTheme="majorHAnsi"/>
+          <w:lang w:val="en-US"/>
+        </w:rPr>
+        <w:t>: INTEGER, FK (REFERENCES Pets), NOT NULL</w:t>
+      </w:r>
+    </w:p>
+    <w:p>
+      <w:pPr>
+        <w:pStyle w:val="a7"/>
+        <w:numPr>
+          <w:ilvl w:val="0"/>
+          <w:numId w:val="6"/>
+        </w:numPr>
+        <w:spacing w:after="0"/>
         <w:rPr>
           <w:rFonts w:asciiTheme="majorHAnsi" w:hAnsiTheme="majorHAnsi"/>
           <w:lang w:val="en-US"/>
@@ -1846,6 +2519,27 @@
           <w:lang w:val="en-US"/>
         </w:rPr>
         <w:t>TIME</w:t>
+      </w:r>
+    </w:p>
+    <w:p>
+      <w:pPr>
+        <w:pStyle w:val="a7"/>
+        <w:numPr>
+          <w:ilvl w:val="0"/>
+          <w:numId w:val="6"/>
+        </w:numPr>
+        <w:spacing w:after="0"/>
+        <w:rPr>
+          <w:rFonts w:asciiTheme="majorHAnsi" w:hAnsiTheme="majorHAnsi"/>
+          <w:lang w:val="en-US"/>
+        </w:rPr>
+      </w:pPr>
+      <w:r>
+        <w:rPr>
+          <w:rFonts w:asciiTheme="majorHAnsi" w:hAnsiTheme="majorHAnsi"/>
+          <w:lang w:val="en-US"/>
+        </w:rPr>
+        <w:t>Duration: TIME, NOT NULL</w:t>
       </w:r>
     </w:p>
     <w:p>
@@ -1900,6 +2594,7 @@
           <w:rFonts w:asciiTheme="majorHAnsi" w:hAnsiTheme="majorHAnsi"/>
           <w:lang w:val="en-US"/>
         </w:rPr>
+        <w:lastRenderedPageBreak/>
         <w:t>PK_Appointments</w:t>
       </w:r>
       <w:proofErr w:type="spellEnd"/>
@@ -2358,9 +3053,12 @@
     <w:p>
       <w:pPr>
         <w:spacing w:after="0"/>
-        <w:jc w:val="both"/>
-        <w:rPr>
-          <w:rFonts w:asciiTheme="majorHAnsi" w:hAnsiTheme="majorHAnsi"/>
+        <w:ind w:left="1494"/>
+        <w:jc w:val="both"/>
+        <w:rPr>
+          <w:rFonts w:ascii="Arial Black" w:hAnsi="Arial Black"/>
+          <w:color w:val="8EAADB" w:themeColor="accent5" w:themeTint="99"/>
+          <w:lang w:val="en-US"/>
         </w:rPr>
       </w:pPr>
     </w:p>
@@ -2384,7 +3082,7 @@
           <w:bCs/>
           <w:lang w:val="en-US"/>
         </w:rPr>
-        <w:t>Vets</w:t>
+        <w:t>Species</w:t>
       </w:r>
       <w:r>
         <w:rPr>
@@ -2392,7 +3090,7 @@
           <w:b/>
           <w:bCs/>
         </w:rPr>
-        <w:t xml:space="preserve"> и </w:t>
+        <w:t>_</w:t>
       </w:r>
       <w:r>
         <w:rPr>
@@ -2401,7 +3099,7 @@
           <w:bCs/>
           <w:lang w:val="en-US"/>
         </w:rPr>
-        <w:t>Appointments</w:t>
+        <w:t>served</w:t>
       </w:r>
       <w:r>
         <w:rPr>
@@ -2409,13 +3107,42 @@
           <w:b/>
           <w:bCs/>
         </w:rPr>
-        <w:t xml:space="preserve"> (Один-ко-Многим): </w:t>
-      </w:r>
-      <w:r>
-        <w:rPr>
-          <w:rFonts w:asciiTheme="majorHAnsi" w:hAnsiTheme="majorHAnsi"/>
-        </w:rPr>
-        <w:t>У одного ветеринара может быть назначено много приёмов.</w:t>
+        <w:t xml:space="preserve"> и </w:t>
+      </w:r>
+      <w:r>
+        <w:rPr>
+          <w:rFonts w:asciiTheme="majorHAnsi" w:hAnsiTheme="majorHAnsi"/>
+          <w:b/>
+          <w:bCs/>
+          <w:lang w:val="en-US"/>
+        </w:rPr>
+        <w:t>Pets</w:t>
+      </w:r>
+      <w:r>
+        <w:rPr>
+          <w:rFonts w:asciiTheme="majorHAnsi" w:hAnsiTheme="majorHAnsi"/>
+        </w:rPr>
+        <w:t xml:space="preserve"> </w:t>
+      </w:r>
+      <w:r>
+        <w:rPr>
+          <w:rFonts w:asciiTheme="majorHAnsi" w:hAnsiTheme="majorHAnsi"/>
+          <w:b/>
+          <w:bCs/>
+        </w:rPr>
+        <w:t>(Один-ко-Многим):</w:t>
+      </w:r>
+      <w:r>
+        <w:rPr>
+          <w:rFonts w:asciiTheme="majorHAnsi" w:hAnsiTheme="majorHAnsi"/>
+        </w:rPr>
+        <w:t xml:space="preserve"> </w:t>
+      </w:r>
+      <w:r>
+        <w:rPr>
+          <w:rFonts w:asciiTheme="majorHAnsi" w:hAnsiTheme="majorHAnsi"/>
+        </w:rPr>
+        <w:t>К одному виду, который обслуживается ветклиникой, может относиться множество питомцев, но один питомец может иметь только один вид.</w:t>
       </w:r>
     </w:p>
     <w:p>
@@ -2428,7 +3155,8 @@
         <w:spacing w:after="0"/>
         <w:jc w:val="both"/>
         <w:rPr>
-          <w:rFonts w:asciiTheme="majorHAnsi" w:hAnsiTheme="majorHAnsi"/>
+          <w:rFonts w:ascii="Arial Black" w:hAnsi="Arial Black"/>
+          <w:color w:val="8EAADB" w:themeColor="accent5" w:themeTint="99"/>
         </w:rPr>
       </w:pPr>
       <w:r>
@@ -2437,7 +3165,7 @@
           <w:color w:val="8EAADB" w:themeColor="accent5" w:themeTint="99"/>
           <w:lang w:val="en-US"/>
         </w:rPr>
-        <w:t>Appointments</w:t>
+        <w:t>Pets</w:t>
       </w:r>
       <w:r>
         <w:rPr>
@@ -2453,12 +3181,13 @@
           <w:color w:val="8EAADB" w:themeColor="accent5" w:themeTint="99"/>
           <w:lang w:val="en-US"/>
         </w:rPr>
-        <w:t>VetID</w:t>
+        <w:t>SpeciesID</w:t>
       </w:r>
       <w:proofErr w:type="spellEnd"/>
       <w:r>
         <w:rPr>
           <w:rFonts w:asciiTheme="majorHAnsi" w:hAnsiTheme="majorHAnsi"/>
+          <w:color w:val="8EAADB" w:themeColor="accent5" w:themeTint="99"/>
         </w:rPr>
         <w:t xml:space="preserve"> </w:t>
       </w:r>
@@ -2466,7 +3195,14 @@
         <w:rPr>
           <w:rFonts w:asciiTheme="majorHAnsi" w:hAnsiTheme="majorHAnsi"/>
         </w:rPr>
-        <w:t>является</w:t>
+        <w:t>является внешним ключом (</w:t>
+      </w:r>
+      <w:r>
+        <w:rPr>
+          <w:rFonts w:asciiTheme="majorHAnsi" w:hAnsiTheme="majorHAnsi"/>
+          <w:lang w:val="en-US"/>
+        </w:rPr>
+        <w:t>foreign</w:t>
       </w:r>
       <w:r>
         <w:rPr>
@@ -2477,43 +3213,6 @@
       <w:r>
         <w:rPr>
           <w:rFonts w:asciiTheme="majorHAnsi" w:hAnsiTheme="majorHAnsi"/>
-        </w:rPr>
-        <w:t>внешним</w:t>
-      </w:r>
-      <w:r>
-        <w:rPr>
-          <w:rFonts w:asciiTheme="majorHAnsi" w:hAnsiTheme="majorHAnsi"/>
-        </w:rPr>
-        <w:t xml:space="preserve"> </w:t>
-      </w:r>
-      <w:r>
-        <w:rPr>
-          <w:rFonts w:asciiTheme="majorHAnsi" w:hAnsiTheme="majorHAnsi"/>
-        </w:rPr>
-        <w:t>ключом</w:t>
-      </w:r>
-      <w:r>
-        <w:rPr>
-          <w:rFonts w:asciiTheme="majorHAnsi" w:hAnsiTheme="majorHAnsi"/>
-        </w:rPr>
-        <w:t xml:space="preserve"> (</w:t>
-      </w:r>
-      <w:r>
-        <w:rPr>
-          <w:rFonts w:asciiTheme="majorHAnsi" w:hAnsiTheme="majorHAnsi"/>
-          <w:lang w:val="en-US"/>
-        </w:rPr>
-        <w:t>foreign</w:t>
-      </w:r>
-      <w:r>
-        <w:rPr>
-          <w:rFonts w:asciiTheme="majorHAnsi" w:hAnsiTheme="majorHAnsi"/>
-        </w:rPr>
-        <w:t xml:space="preserve"> </w:t>
-      </w:r>
-      <w:r>
-        <w:rPr>
-          <w:rFonts w:asciiTheme="majorHAnsi" w:hAnsiTheme="majorHAnsi"/>
           <w:lang w:val="en-US"/>
         </w:rPr>
         <w:t>key</w:t>
@@ -2522,31 +3221,7 @@
         <w:rPr>
           <w:rFonts w:asciiTheme="majorHAnsi" w:hAnsiTheme="majorHAnsi"/>
         </w:rPr>
-        <w:t xml:space="preserve">), </w:t>
-      </w:r>
-      <w:r>
-        <w:rPr>
-          <w:rFonts w:asciiTheme="majorHAnsi" w:hAnsiTheme="majorHAnsi"/>
-        </w:rPr>
-        <w:t>ссылающимся</w:t>
-      </w:r>
-      <w:r>
-        <w:rPr>
-          <w:rFonts w:asciiTheme="majorHAnsi" w:hAnsiTheme="majorHAnsi"/>
-        </w:rPr>
-        <w:t xml:space="preserve"> </w:t>
-      </w:r>
-      <w:r>
-        <w:rPr>
-          <w:rFonts w:asciiTheme="majorHAnsi" w:hAnsiTheme="majorHAnsi"/>
-        </w:rPr>
-        <w:t>на</w:t>
-      </w:r>
-      <w:r>
-        <w:rPr>
-          <w:rFonts w:asciiTheme="majorHAnsi" w:hAnsiTheme="majorHAnsi"/>
-        </w:rPr>
-        <w:t xml:space="preserve"> </w:t>
+        <w:t xml:space="preserve">), ссылающимся на </w:t>
       </w:r>
       <w:r>
         <w:rPr>
@@ -2554,25 +3229,42 @@
           <w:color w:val="8EAADB" w:themeColor="accent5" w:themeTint="99"/>
           <w:lang w:val="en-US"/>
         </w:rPr>
-        <w:t>Vets</w:t>
+        <w:t>Species</w:t>
       </w:r>
       <w:r>
         <w:rPr>
           <w:rFonts w:ascii="Bahnschrift" w:hAnsi="Bahnschrift"/>
           <w:color w:val="8EAADB" w:themeColor="accent5" w:themeTint="99"/>
         </w:rPr>
-        <w:t>.</w:t>
-      </w:r>
-      <w:proofErr w:type="spellStart"/>
+        <w:t>_</w:t>
+      </w:r>
+      <w:proofErr w:type="gramStart"/>
       <w:r>
         <w:rPr>
           <w:rFonts w:ascii="Bahnschrift" w:hAnsi="Bahnschrift"/>
           <w:color w:val="8EAADB" w:themeColor="accent5" w:themeTint="99"/>
           <w:lang w:val="en-US"/>
         </w:rPr>
-        <w:t>VetID</w:t>
+        <w:t>served</w:t>
+      </w:r>
+      <w:r>
+        <w:rPr>
+          <w:rFonts w:ascii="Bahnschrift" w:hAnsi="Bahnschrift"/>
+          <w:color w:val="8EAADB" w:themeColor="accent5" w:themeTint="99"/>
+        </w:rPr>
+        <w:t>.</w:t>
+      </w:r>
+      <w:proofErr w:type="spellStart"/>
+      <w:r>
+        <w:rPr>
+          <w:rFonts w:ascii="Bahnschrift" w:hAnsi="Bahnschrift"/>
+          <w:color w:val="8EAADB" w:themeColor="accent5" w:themeTint="99"/>
+          <w:lang w:val="en-US"/>
+        </w:rPr>
+        <w:t>SpeciedID</w:t>
       </w:r>
       <w:proofErr w:type="spellEnd"/>
+      <w:proofErr w:type="gramEnd"/>
     </w:p>
     <w:p>
       <w:pPr>
@@ -2603,6 +3295,225 @@
           <w:bCs/>
           <w:lang w:val="en-US"/>
         </w:rPr>
+        <w:t>Vets</w:t>
+      </w:r>
+      <w:r>
+        <w:rPr>
+          <w:rFonts w:asciiTheme="majorHAnsi" w:hAnsiTheme="majorHAnsi"/>
+          <w:b/>
+          <w:bCs/>
+        </w:rPr>
+        <w:t xml:space="preserve"> и </w:t>
+      </w:r>
+      <w:r>
+        <w:rPr>
+          <w:rFonts w:asciiTheme="majorHAnsi" w:hAnsiTheme="majorHAnsi"/>
+          <w:b/>
+          <w:bCs/>
+          <w:lang w:val="en-US"/>
+        </w:rPr>
+        <w:t>Appointments</w:t>
+      </w:r>
+      <w:r>
+        <w:rPr>
+          <w:rFonts w:asciiTheme="majorHAnsi" w:hAnsiTheme="majorHAnsi"/>
+          <w:b/>
+          <w:bCs/>
+        </w:rPr>
+        <w:t xml:space="preserve"> (Один-ко-Многим): </w:t>
+      </w:r>
+      <w:r>
+        <w:rPr>
+          <w:rFonts w:asciiTheme="majorHAnsi" w:hAnsiTheme="majorHAnsi"/>
+        </w:rPr>
+        <w:t>У одного ветеринара может быть назначено много приёмов.</w:t>
+      </w:r>
+    </w:p>
+    <w:p>
+      <w:pPr>
+        <w:pStyle w:val="a7"/>
+        <w:numPr>
+          <w:ilvl w:val="0"/>
+          <w:numId w:val="18"/>
+        </w:numPr>
+        <w:spacing w:after="0"/>
+        <w:jc w:val="both"/>
+        <w:rPr>
+          <w:rFonts w:asciiTheme="majorHAnsi" w:hAnsiTheme="majorHAnsi"/>
+        </w:rPr>
+      </w:pPr>
+      <w:r>
+        <w:rPr>
+          <w:rFonts w:ascii="Bahnschrift" w:hAnsi="Bahnschrift"/>
+          <w:color w:val="8EAADB" w:themeColor="accent5" w:themeTint="99"/>
+          <w:lang w:val="en-US"/>
+        </w:rPr>
+        <w:t>Appointments</w:t>
+      </w:r>
+      <w:r>
+        <w:rPr>
+          <w:rFonts w:ascii="Bahnschrift" w:hAnsi="Bahnschrift"/>
+          <w:color w:val="8EAADB" w:themeColor="accent5" w:themeTint="99"/>
+        </w:rPr>
+        <w:t>.</w:t>
+      </w:r>
+      <w:proofErr w:type="spellStart"/>
+      <w:r>
+        <w:rPr>
+          <w:rFonts w:ascii="Bahnschrift" w:hAnsi="Bahnschrift"/>
+          <w:color w:val="8EAADB" w:themeColor="accent5" w:themeTint="99"/>
+          <w:lang w:val="en-US"/>
+        </w:rPr>
+        <w:t>VetID</w:t>
+      </w:r>
+      <w:proofErr w:type="spellEnd"/>
+      <w:r>
+        <w:rPr>
+          <w:rFonts w:asciiTheme="majorHAnsi" w:hAnsiTheme="majorHAnsi"/>
+        </w:rPr>
+        <w:t xml:space="preserve"> </w:t>
+      </w:r>
+      <w:r>
+        <w:rPr>
+          <w:rFonts w:asciiTheme="majorHAnsi" w:hAnsiTheme="majorHAnsi"/>
+        </w:rPr>
+        <w:t>является</w:t>
+      </w:r>
+      <w:r>
+        <w:rPr>
+          <w:rFonts w:asciiTheme="majorHAnsi" w:hAnsiTheme="majorHAnsi"/>
+        </w:rPr>
+        <w:t xml:space="preserve"> </w:t>
+      </w:r>
+      <w:r>
+        <w:rPr>
+          <w:rFonts w:asciiTheme="majorHAnsi" w:hAnsiTheme="majorHAnsi"/>
+        </w:rPr>
+        <w:t>внешним</w:t>
+      </w:r>
+      <w:r>
+        <w:rPr>
+          <w:rFonts w:asciiTheme="majorHAnsi" w:hAnsiTheme="majorHAnsi"/>
+        </w:rPr>
+        <w:t xml:space="preserve"> </w:t>
+      </w:r>
+      <w:r>
+        <w:rPr>
+          <w:rFonts w:asciiTheme="majorHAnsi" w:hAnsiTheme="majorHAnsi"/>
+        </w:rPr>
+        <w:t>ключом</w:t>
+      </w:r>
+      <w:r>
+        <w:rPr>
+          <w:rFonts w:asciiTheme="majorHAnsi" w:hAnsiTheme="majorHAnsi"/>
+        </w:rPr>
+        <w:t xml:space="preserve"> (</w:t>
+      </w:r>
+      <w:r>
+        <w:rPr>
+          <w:rFonts w:asciiTheme="majorHAnsi" w:hAnsiTheme="majorHAnsi"/>
+          <w:lang w:val="en-US"/>
+        </w:rPr>
+        <w:t>foreign</w:t>
+      </w:r>
+      <w:r>
+        <w:rPr>
+          <w:rFonts w:asciiTheme="majorHAnsi" w:hAnsiTheme="majorHAnsi"/>
+        </w:rPr>
+        <w:t xml:space="preserve"> </w:t>
+      </w:r>
+      <w:r>
+        <w:rPr>
+          <w:rFonts w:asciiTheme="majorHAnsi" w:hAnsiTheme="majorHAnsi"/>
+          <w:lang w:val="en-US"/>
+        </w:rPr>
+        <w:t>key</w:t>
+      </w:r>
+      <w:r>
+        <w:rPr>
+          <w:rFonts w:asciiTheme="majorHAnsi" w:hAnsiTheme="majorHAnsi"/>
+        </w:rPr>
+        <w:t xml:space="preserve">), </w:t>
+      </w:r>
+      <w:r>
+        <w:rPr>
+          <w:rFonts w:asciiTheme="majorHAnsi" w:hAnsiTheme="majorHAnsi"/>
+        </w:rPr>
+        <w:t>ссылающимся</w:t>
+      </w:r>
+      <w:r>
+        <w:rPr>
+          <w:rFonts w:asciiTheme="majorHAnsi" w:hAnsiTheme="majorHAnsi"/>
+        </w:rPr>
+        <w:t xml:space="preserve"> </w:t>
+      </w:r>
+      <w:r>
+        <w:rPr>
+          <w:rFonts w:asciiTheme="majorHAnsi" w:hAnsiTheme="majorHAnsi"/>
+        </w:rPr>
+        <w:t>на</w:t>
+      </w:r>
+      <w:r>
+        <w:rPr>
+          <w:rFonts w:asciiTheme="majorHAnsi" w:hAnsiTheme="majorHAnsi"/>
+        </w:rPr>
+        <w:t xml:space="preserve"> </w:t>
+      </w:r>
+      <w:r>
+        <w:rPr>
+          <w:rFonts w:ascii="Bahnschrift" w:hAnsi="Bahnschrift"/>
+          <w:color w:val="8EAADB" w:themeColor="accent5" w:themeTint="99"/>
+          <w:lang w:val="en-US"/>
+        </w:rPr>
+        <w:t>Vets</w:t>
+      </w:r>
+      <w:r>
+        <w:rPr>
+          <w:rFonts w:ascii="Bahnschrift" w:hAnsi="Bahnschrift"/>
+          <w:color w:val="8EAADB" w:themeColor="accent5" w:themeTint="99"/>
+        </w:rPr>
+        <w:t>.</w:t>
+      </w:r>
+      <w:proofErr w:type="spellStart"/>
+      <w:r>
+        <w:rPr>
+          <w:rFonts w:ascii="Bahnschrift" w:hAnsi="Bahnschrift"/>
+          <w:color w:val="8EAADB" w:themeColor="accent5" w:themeTint="99"/>
+          <w:lang w:val="en-US"/>
+        </w:rPr>
+        <w:t>VetID</w:t>
+      </w:r>
+      <w:proofErr w:type="spellEnd"/>
+    </w:p>
+    <w:p>
+      <w:pPr>
+        <w:spacing w:after="0"/>
+        <w:jc w:val="both"/>
+        <w:rPr>
+          <w:rFonts w:asciiTheme="majorHAnsi" w:hAnsiTheme="majorHAnsi"/>
+        </w:rPr>
+      </w:pPr>
+    </w:p>
+    <w:p>
+      <w:pPr>
+        <w:pStyle w:val="a7"/>
+        <w:numPr>
+          <w:ilvl w:val="0"/>
+          <w:numId w:val="17"/>
+        </w:numPr>
+        <w:spacing w:after="0"/>
+        <w:jc w:val="both"/>
+        <w:rPr>
+          <w:rFonts w:asciiTheme="majorHAnsi" w:hAnsiTheme="majorHAnsi"/>
+        </w:rPr>
+      </w:pPr>
+      <w:r>
+        <w:rPr>
+          <w:rFonts w:asciiTheme="majorHAnsi" w:hAnsiTheme="majorHAnsi"/>
+          <w:b/>
+          <w:bCs/>
+          <w:lang w:val="en-US"/>
+        </w:rPr>
         <w:t>Pets</w:t>
       </w:r>
       <w:r>
@@ -2657,7 +3568,6 @@
           <w:color w:val="8EAADB" w:themeColor="accent5" w:themeTint="99"/>
           <w:lang w:val="en-US"/>
         </w:rPr>
-        <w:lastRenderedPageBreak/>
         <w:t>Appointments</w:t>
       </w:r>
       <w:r>
@@ -2795,15 +3705,6 @@
         <w:t>PetID</w:t>
       </w:r>
       <w:proofErr w:type="spellEnd"/>
-    </w:p>
-    <w:p>
-      <w:pPr>
-        <w:spacing w:after="0"/>
-        <w:jc w:val="both"/>
-        <w:rPr>
-          <w:rFonts w:asciiTheme="majorHAnsi" w:hAnsiTheme="majorHAnsi"/>
-        </w:rPr>
-      </w:pPr>
     </w:p>
     <w:p>
       <w:pPr>
@@ -3123,6 +4024,15 @@
         <w:jc w:val="both"/>
         <w:rPr>
           <w:rFonts w:asciiTheme="majorHAnsi" w:hAnsiTheme="majorHAnsi"/>
+        </w:rPr>
+      </w:pPr>
+    </w:p>
+    <w:p>
+      <w:pPr>
+        <w:spacing w:after="0"/>
+        <w:jc w:val="both"/>
+        <w:rPr>
+          <w:rFonts w:asciiTheme="majorHAnsi" w:hAnsiTheme="majorHAnsi"/>
           <w:lang w:val="en-US"/>
         </w:rPr>
       </w:pPr>
@@ -3158,6 +4068,7 @@
           <w:szCs w:val="40"/>
           <w:lang w:val="en-US"/>
         </w:rPr>
+        <w:lastRenderedPageBreak/>
         <w:t>Part</w:t>
       </w:r>
       <w:r>
@@ -3234,12 +4145,13 @@
       <w:r>
         <w:rPr>
           <w:rFonts w:asciiTheme="majorHAnsi" w:hAnsiTheme="majorHAnsi"/>
+          <w:noProof/>
         </w:rPr>
         <w:drawing>
-          <wp:inline distT="0" distB="0" distL="0" distR="0" wp14:anchorId="00289817" wp14:editId="72F5D73C">
-            <wp:extent cx="5939790" cy="4163060"/>
-            <wp:effectExtent l="0" t="0" r="3810" b="8890"/>
-            <wp:docPr id="1526573070" name="Рисунок 1"/>
+          <wp:inline distT="0" distB="0" distL="0" distR="0" wp14:anchorId="28143C8E" wp14:editId="77118FE7">
+            <wp:extent cx="5939790" cy="4939030"/>
+            <wp:effectExtent l="0" t="0" r="0" b="0"/>
+            <wp:docPr id="1054749156" name="Рисунок 1"/>
             <wp:cNvGraphicFramePr>
               <a:graphicFrameLocks xmlns:a="http://schemas.openxmlformats.org/drawingml/2006/main" noChangeAspect="1"/>
             </wp:cNvGraphicFramePr>
@@ -3247,11 +4159,17 @@
               <a:graphicData uri="http://schemas.openxmlformats.org/drawingml/2006/picture">
                 <pic:pic xmlns:pic="http://schemas.openxmlformats.org/drawingml/2006/picture">
                   <pic:nvPicPr>
-                    <pic:cNvPr id="1526573070" name=""/>
+                    <pic:cNvPr id="1054749156" name="Рисунок 1054749156"/>
                     <pic:cNvPicPr/>
                   </pic:nvPicPr>
                   <pic:blipFill>
-                    <a:blip r:embed="rId5"/>
+                    <a:blip r:embed="rId5">
+                      <a:extLst>
+                        <a:ext uri="{28A0092B-C50C-407E-A947-70E740481C1C}">
+                          <a14:useLocalDpi xmlns:a14="http://schemas.microsoft.com/office/drawing/2010/main" val="0"/>
+                        </a:ext>
+                      </a:extLst>
+                    </a:blip>
                     <a:stretch>
                       <a:fillRect/>
                     </a:stretch>
@@ -3259,7 +4177,7 @@
                   <pic:spPr>
                     <a:xfrm>
                       <a:off x="0" y="0"/>
-                      <a:ext cx="5939790" cy="4163060"/>
+                      <a:ext cx="5939790" cy="4939030"/>
                     </a:xfrm>
                     <a:prstGeom prst="rect">
                       <a:avLst/>
@@ -3287,7 +4205,7 @@
   <w:abstractNum w:abstractNumId="0" w15:restartNumberingAfterBreak="0">
     <w:nsid w:val="00822FE6"/>
     <w:multiLevelType w:val="hybridMultilevel"/>
-    <w:tmpl w:val="1F288998"/>
+    <w:tmpl w:val="1FD8E31E"/>
     <w:lvl w:ilvl="0" w:tplc="04190001">
       <w:start w:val="1"/>
       <w:numFmt w:val="bullet"/>

</xml_diff>